<commit_message>
DB with 4 tables - Praktika 5th meeting
</commit_message>
<xml_diff>
--- a/Πρακτικά ομάδας.docx
+++ b/Πρακτικά ομάδας.docx
@@ -16,7 +16,30 @@
           <w:b/>
           <w:bCs/>
         </w:rPr>
-        <w:t xml:space="preserve">Πρακτικά ομάδας </w:t>
+        <w:t>Πρακτικά</w:t>
+      </w:r>
+      <w:r>
+        <w:rPr>
+          <w:b/>
+          <w:bCs/>
+          <w:lang w:val="en-US"/>
+        </w:rPr>
+        <w:t xml:space="preserve"> </w:t>
+      </w:r>
+      <w:r>
+        <w:rPr>
+          <w:b/>
+          <w:bCs/>
+        </w:rPr>
+        <w:t>ομάδας</w:t>
+      </w:r>
+      <w:r>
+        <w:rPr>
+          <w:b/>
+          <w:bCs/>
+          <w:lang w:val="en-US"/>
+        </w:rPr>
+        <w:t xml:space="preserve"> </w:t>
       </w:r>
       <w:r>
         <w:rPr>
@@ -63,8 +86,14 @@
         <w:pBdr>
           <w:bottom w:val="single" w:sz="6" w:space="1" w:color="auto"/>
         </w:pBdr>
-      </w:pPr>
-      <w:r>
+        <w:rPr>
+          <w:lang w:val="en-US"/>
+        </w:rPr>
+      </w:pPr>
+      <w:r>
+        <w:rPr>
+          <w:lang w:val="en-US"/>
+        </w:rPr>
         <w:t>3</w:t>
       </w:r>
       <w:r>
@@ -140,6 +169,9 @@
         <w:tab/>
       </w:r>
       <w:r>
+        <w:rPr>
+          <w:lang w:val="en-US"/>
+        </w:rPr>
         <w:t>14/11/2022</w:t>
       </w:r>
     </w:p>
@@ -286,14 +318,12 @@
       <w:r>
         <w:t xml:space="preserve"> </w:t>
       </w:r>
-      <w:proofErr w:type="spellStart"/>
       <w:r>
         <w:rPr>
           <w:lang w:val="en-US"/>
         </w:rPr>
         <w:t>miro</w:t>
       </w:r>
-      <w:proofErr w:type="spellEnd"/>
     </w:p>
     <w:p>
       <w:pPr>
@@ -316,15 +346,7 @@
         <w:t xml:space="preserve"> </w:t>
       </w:r>
       <w:r>
-        <w:t xml:space="preserve">με διαγράμματα. Πάνω: </w:t>
-      </w:r>
-      <w:proofErr w:type="spellStart"/>
-      <w:r>
-        <w:t>ραβδόγραμμα</w:t>
-      </w:r>
-      <w:proofErr w:type="spellEnd"/>
-      <w:r>
-        <w:t xml:space="preserve"> με σχολές, εγγεγραμμένους, χρόνο. Κάτω</w:t>
+        <w:t>με διαγράμματα. Πάνω: ραβδόγραμμα με σχολές, εγγεγραμμένους, χρόνο. Κάτω</w:t>
       </w:r>
       <w:r>
         <w:t xml:space="preserve">: </w:t>
@@ -459,23 +481,7 @@
         </w:numPr>
       </w:pPr>
       <w:r>
-        <w:t xml:space="preserve">Σκέψεις για: ιστόγραμμα προτιμήσεις/πού πέρασα, διάγραμμα: είσαι από </w:t>
-      </w:r>
-      <w:proofErr w:type="spellStart"/>
-      <w:r>
-        <w:t>επαλ</w:t>
-      </w:r>
-      <w:proofErr w:type="spellEnd"/>
-      <w:r>
-        <w:t>/</w:t>
-      </w:r>
-      <w:proofErr w:type="spellStart"/>
-      <w:r>
-        <w:t>γελ</w:t>
-      </w:r>
-      <w:proofErr w:type="spellEnd"/>
-      <w:r>
-        <w:t>, σε ποια σχολή περνάς?</w:t>
+        <w:t>Σκέψεις για: ιστόγραμμα προτιμήσεις/πού πέρασα, διάγραμμα: είσαι από επαλ/γελ, σε ποια σχολή περνάς?</w:t>
       </w:r>
     </w:p>
     <w:p/>
@@ -705,14 +711,12 @@
       <w:r>
         <w:t xml:space="preserve">Η Μαρία έφτιαξε τα </w:t>
       </w:r>
-      <w:proofErr w:type="spellStart"/>
       <w:r>
         <w:rPr>
           <w:lang w:val="en-US"/>
         </w:rPr>
         <w:t>divs</w:t>
       </w:r>
-      <w:proofErr w:type="spellEnd"/>
       <w:r>
         <w:t xml:space="preserve"> </w:t>
       </w:r>
@@ -818,28 +822,24 @@
       <w:r>
         <w:t xml:space="preserve">Ο Νίκος παρέθεσε </w:t>
       </w:r>
-      <w:proofErr w:type="spellStart"/>
       <w:r>
         <w:rPr>
           <w:lang w:val="en-US"/>
         </w:rPr>
         <w:t>csvs</w:t>
       </w:r>
-      <w:proofErr w:type="spellEnd"/>
       <w:r>
         <w:t xml:space="preserve"> </w:t>
       </w:r>
       <w:r>
         <w:t xml:space="preserve">με τα στοιχεία του </w:t>
       </w:r>
-      <w:proofErr w:type="spellStart"/>
       <w:r>
         <w:rPr>
           <w:lang w:val="en-US"/>
         </w:rPr>
         <w:t>api</w:t>
       </w:r>
-      <w:proofErr w:type="spellEnd"/>
     </w:p>
     <w:p>
       <w:pPr>
@@ -967,15 +967,7 @@
         </w:numPr>
       </w:pPr>
       <w:r>
-        <w:t xml:space="preserve">Ανάθεση </w:t>
-      </w:r>
-      <w:proofErr w:type="spellStart"/>
-      <w:r>
-        <w:t>ψηφιοποίησης</w:t>
-      </w:r>
-      <w:proofErr w:type="spellEnd"/>
-      <w:r>
-        <w:t xml:space="preserve"> πρακτικών</w:t>
+        <w:t>Ανάθεση ψηφιοποίησης πρακτικών</w:t>
       </w:r>
     </w:p>
     <w:p>
@@ -1024,6 +1016,448 @@
       </w:r>
       <w:r>
         <w:t xml:space="preserve"> </w:t>
+      </w:r>
+    </w:p>
+    <w:p/>
+    <w:p>
+      <w:pPr>
+        <w:pBdr>
+          <w:bottom w:val="single" w:sz="6" w:space="1" w:color="auto"/>
+        </w:pBdr>
+        <w:rPr>
+          <w:lang w:val="en-US"/>
+        </w:rPr>
+      </w:pPr>
+      <w:r>
+        <w:rPr>
+          <w:lang w:val="en-US"/>
+        </w:rPr>
+        <w:t>5</w:t>
+      </w:r>
+      <w:r>
+        <w:rPr>
+          <w:vertAlign w:val="superscript"/>
+        </w:rPr>
+        <w:t>ο</w:t>
+      </w:r>
+      <w:r>
+        <w:t xml:space="preserve"> </w:t>
+      </w:r>
+      <w:r>
+        <w:rPr>
+          <w:lang w:val="en-US"/>
+        </w:rPr>
+        <w:t>meeting</w:t>
+      </w:r>
+      <w:r>
+        <w:rPr>
+          <w:lang w:val="en-US"/>
+        </w:rPr>
+        <w:tab/>
+      </w:r>
+      <w:r>
+        <w:rPr>
+          <w:lang w:val="en-US"/>
+        </w:rPr>
+        <w:tab/>
+      </w:r>
+      <w:r>
+        <w:rPr>
+          <w:lang w:val="en-US"/>
+        </w:rPr>
+        <w:tab/>
+      </w:r>
+      <w:r>
+        <w:rPr>
+          <w:lang w:val="en-US"/>
+        </w:rPr>
+        <w:tab/>
+      </w:r>
+      <w:r>
+        <w:rPr>
+          <w:lang w:val="en-US"/>
+        </w:rPr>
+        <w:tab/>
+      </w:r>
+      <w:r>
+        <w:rPr>
+          <w:lang w:val="en-US"/>
+        </w:rPr>
+        <w:tab/>
+      </w:r>
+      <w:r>
+        <w:rPr>
+          <w:lang w:val="en-US"/>
+        </w:rPr>
+        <w:tab/>
+      </w:r>
+      <w:r>
+        <w:rPr>
+          <w:lang w:val="en-US"/>
+        </w:rPr>
+        <w:tab/>
+      </w:r>
+      <w:r>
+        <w:rPr>
+          <w:lang w:val="en-US"/>
+        </w:rPr>
+        <w:tab/>
+      </w:r>
+      <w:r>
+        <w:rPr>
+          <w:lang w:val="en-US"/>
+        </w:rPr>
+        <w:tab/>
+        <w:t>2</w:t>
+      </w:r>
+      <w:r>
+        <w:rPr>
+          <w:lang w:val="en-US"/>
+        </w:rPr>
+        <w:t>8</w:t>
+      </w:r>
+      <w:r>
+        <w:rPr>
+          <w:lang w:val="en-US"/>
+        </w:rPr>
+        <w:t>/11/2022</w:t>
+      </w:r>
+    </w:p>
+    <w:p>
+      <w:pPr>
+        <w:pStyle w:val="ListParagraph"/>
+        <w:numPr>
+          <w:ilvl w:val="0"/>
+          <w:numId w:val="3"/>
+        </w:numPr>
+      </w:pPr>
+      <w:r>
+        <w:t xml:space="preserve">Παρουσίαση του </w:t>
+      </w:r>
+      <w:r>
+        <w:rPr>
+          <w:lang w:val="en-US"/>
+        </w:rPr>
+        <w:t>cities</w:t>
+      </w:r>
+      <w:r>
+        <w:t xml:space="preserve"> </w:t>
+      </w:r>
+      <w:r>
+        <w:rPr>
+          <w:lang w:val="en-US"/>
+        </w:rPr>
+        <w:t>page</w:t>
+      </w:r>
+      <w:r>
+        <w:t xml:space="preserve">, </w:t>
+      </w:r>
+      <w:r>
+        <w:t xml:space="preserve">του αλλαγμένου </w:t>
+      </w:r>
+      <w:r>
+        <w:rPr>
+          <w:lang w:val="en-US"/>
+        </w:rPr>
+        <w:t>start</w:t>
+      </w:r>
+      <w:r>
+        <w:t xml:space="preserve"> </w:t>
+      </w:r>
+      <w:r>
+        <w:rPr>
+          <w:lang w:val="en-US"/>
+        </w:rPr>
+        <w:t>page</w:t>
+      </w:r>
+      <w:r>
+        <w:t xml:space="preserve">, </w:t>
+      </w:r>
+      <w:r>
+        <w:t xml:space="preserve">και της δημιουργίας πρωτοτύπου του </w:t>
+      </w:r>
+      <w:r>
+        <w:rPr>
+          <w:lang w:val="en-US"/>
+        </w:rPr>
+        <w:t>dashboard</w:t>
+      </w:r>
+      <w:r>
+        <w:t xml:space="preserve"> </w:t>
+      </w:r>
+      <w:r>
+        <w:t>από τη Μαρία</w:t>
+      </w:r>
+    </w:p>
+    <w:p>
+      <w:pPr>
+        <w:pStyle w:val="ListParagraph"/>
+        <w:numPr>
+          <w:ilvl w:val="0"/>
+          <w:numId w:val="3"/>
+        </w:numPr>
+      </w:pPr>
+      <w:r>
+        <w:t xml:space="preserve">Επίλυση θεμάτων με το </w:t>
+      </w:r>
+      <w:r>
+        <w:rPr>
+          <w:lang w:val="en-US"/>
+        </w:rPr>
+        <w:t>version</w:t>
+      </w:r>
+      <w:r>
+        <w:t xml:space="preserve"> </w:t>
+      </w:r>
+      <w:r>
+        <w:rPr>
+          <w:lang w:val="en-US"/>
+        </w:rPr>
+        <w:t>control</w:t>
+      </w:r>
+    </w:p>
+    <w:p>
+      <w:pPr>
+        <w:pStyle w:val="ListParagraph"/>
+        <w:numPr>
+          <w:ilvl w:val="0"/>
+          <w:numId w:val="3"/>
+        </w:numPr>
+      </w:pPr>
+      <w:r>
+        <w:t xml:space="preserve">Νέο </w:t>
+      </w:r>
+      <w:r>
+        <w:rPr>
+          <w:lang w:val="en-US"/>
+        </w:rPr>
+        <w:t>branch</w:t>
+      </w:r>
+      <w:r>
+        <w:t xml:space="preserve"> – </w:t>
+      </w:r>
+      <w:r>
+        <w:t xml:space="preserve">Η Μαρία ανεβάζει τις αλλαγές της για το </w:t>
+      </w:r>
+      <w:r>
+        <w:rPr>
+          <w:lang w:val="en-US"/>
+        </w:rPr>
+        <w:t>front</w:t>
+      </w:r>
+      <w:r>
+        <w:t>-</w:t>
+      </w:r>
+      <w:r>
+        <w:rPr>
+          <w:lang w:val="en-US"/>
+        </w:rPr>
+        <w:t>end</w:t>
+      </w:r>
+    </w:p>
+    <w:p>
+      <w:pPr>
+        <w:pStyle w:val="ListParagraph"/>
+        <w:numPr>
+          <w:ilvl w:val="0"/>
+          <w:numId w:val="3"/>
+        </w:numPr>
+      </w:pPr>
+      <w:r>
+        <w:t xml:space="preserve">Ο Νίκος θα τελειώσει τα </w:t>
+      </w:r>
+      <w:r>
+        <w:rPr>
+          <w:lang w:val="en-US"/>
+        </w:rPr>
+        <w:t>mock</w:t>
+      </w:r>
+      <w:r>
+        <w:t>-</w:t>
+      </w:r>
+      <w:r>
+        <w:rPr>
+          <w:lang w:val="en-US"/>
+        </w:rPr>
+        <w:t>ups</w:t>
+      </w:r>
+    </w:p>
+    <w:p>
+      <w:pPr>
+        <w:pStyle w:val="ListParagraph"/>
+        <w:numPr>
+          <w:ilvl w:val="0"/>
+          <w:numId w:val="3"/>
+        </w:numPr>
+      </w:pPr>
+      <w:r>
+        <w:lastRenderedPageBreak/>
+        <w:t xml:space="preserve">Η Στέλλα αναλαμβάνει τα </w:t>
+      </w:r>
+      <w:r>
+        <w:rPr>
+          <w:lang w:val="en-US"/>
+        </w:rPr>
+        <w:t>UMLs</w:t>
+      </w:r>
+    </w:p>
+    <w:p>
+      <w:pPr>
+        <w:pStyle w:val="ListParagraph"/>
+        <w:numPr>
+          <w:ilvl w:val="0"/>
+          <w:numId w:val="3"/>
+        </w:numPr>
+      </w:pPr>
+      <w:r>
+        <w:t xml:space="preserve">Η Μαρία αναλαμβάνει να συνεχίσει το </w:t>
+      </w:r>
+      <w:r>
+        <w:rPr>
+          <w:lang w:val="en-US"/>
+        </w:rPr>
+        <w:t>dashboard</w:t>
+      </w:r>
+      <w:r>
+        <w:t xml:space="preserve"> </w:t>
+      </w:r>
+      <w:r>
+        <w:t xml:space="preserve">και το </w:t>
+      </w:r>
+      <w:r>
+        <w:rPr>
+          <w:lang w:val="en-US"/>
+        </w:rPr>
+        <w:t>cities</w:t>
+      </w:r>
+      <w:r>
+        <w:t xml:space="preserve"> </w:t>
+      </w:r>
+      <w:r>
+        <w:rPr>
+          <w:lang w:val="en-US"/>
+        </w:rPr>
+        <w:t>page</w:t>
+      </w:r>
+    </w:p>
+    <w:p>
+      <w:pPr>
+        <w:pStyle w:val="ListParagraph"/>
+        <w:numPr>
+          <w:ilvl w:val="0"/>
+          <w:numId w:val="3"/>
+        </w:numPr>
+      </w:pPr>
+      <w:r>
+        <w:t xml:space="preserve">Ο Νίκος παρουσιάζει τη δουλειά του με τα </w:t>
+      </w:r>
+      <w:r>
+        <w:rPr>
+          <w:lang w:val="en-US"/>
+        </w:rPr>
+        <w:t>python</w:t>
+      </w:r>
+      <w:r>
+        <w:t xml:space="preserve"> </w:t>
+      </w:r>
+      <w:r>
+        <w:rPr>
+          <w:lang w:val="en-US"/>
+        </w:rPr>
+        <w:t>scripts</w:t>
+      </w:r>
+    </w:p>
+    <w:p>
+      <w:pPr>
+        <w:pStyle w:val="ListParagraph"/>
+        <w:numPr>
+          <w:ilvl w:val="0"/>
+          <w:numId w:val="3"/>
+        </w:numPr>
+      </w:pPr>
+      <w:r>
+        <w:t xml:space="preserve">Η Στέλλα θα αναπτύξει και θα ολοκληρώσει τα </w:t>
+      </w:r>
+      <w:r>
+        <w:rPr>
+          <w:lang w:val="en-US"/>
+        </w:rPr>
+        <w:t>charts</w:t>
+      </w:r>
+      <w:r>
+        <w:t xml:space="preserve"> </w:t>
+      </w:r>
+      <w:r>
+        <w:t xml:space="preserve">στο </w:t>
+      </w:r>
+      <w:r>
+        <w:rPr>
+          <w:lang w:val="en-US"/>
+        </w:rPr>
+        <w:t>front</w:t>
+      </w:r>
+      <w:r>
+        <w:t>-</w:t>
+      </w:r>
+      <w:r>
+        <w:rPr>
+          <w:lang w:val="en-US"/>
+        </w:rPr>
+        <w:t>end</w:t>
+      </w:r>
+      <w:r>
+        <w:t xml:space="preserve"> </w:t>
+      </w:r>
+      <w:r>
+        <w:t xml:space="preserve">με τα επιμέρους </w:t>
+      </w:r>
+      <w:r>
+        <w:rPr>
+          <w:lang w:val="en-US"/>
+        </w:rPr>
+        <w:t>fetch</w:t>
+      </w:r>
+    </w:p>
+    <w:p>
+      <w:pPr>
+        <w:pStyle w:val="ListParagraph"/>
+        <w:numPr>
+          <w:ilvl w:val="0"/>
+          <w:numId w:val="3"/>
+        </w:numPr>
+      </w:pPr>
+      <w:r>
+        <w:t xml:space="preserve">Η Στέλλα παρουσιάζει τη βάση </w:t>
+      </w:r>
+      <w:r>
+        <w:rPr>
+          <w:lang w:val="en-US"/>
+        </w:rPr>
+        <w:t>MySQL</w:t>
+      </w:r>
+      <w:r>
+        <w:t xml:space="preserve"> </w:t>
+      </w:r>
+      <w:r>
+        <w:t>προς συζήτηση</w:t>
+      </w:r>
+    </w:p>
+    <w:p>
+      <w:pPr>
+        <w:pStyle w:val="ListParagraph"/>
+        <w:numPr>
+          <w:ilvl w:val="0"/>
+          <w:numId w:val="3"/>
+        </w:numPr>
+      </w:pPr>
+      <w:r>
+        <w:t xml:space="preserve">Ο Νίκος αναλαμβάνει να οριστικοποιήσει τη βάση </w:t>
+      </w:r>
+      <w:r>
+        <w:rPr>
+          <w:lang w:val="en-US"/>
+        </w:rPr>
+        <w:t>MySQL</w:t>
       </w:r>
     </w:p>
     <w:sectPr>
@@ -1089,6 +1523,119 @@
 <file path=word/numbering.xml><?xml version="1.0" encoding="utf-8"?>
 <w:numbering xmlns:wpc="http://schemas.microsoft.com/office/word/2010/wordprocessingCanvas" xmlns:cx="http://schemas.microsoft.com/office/drawing/2014/chartex" xmlns:cx1="http://schemas.microsoft.com/office/drawing/2015/9/8/chartex" xmlns:cx2="http://schemas.microsoft.com/office/drawing/2015/10/21/chartex" xmlns:cx3="http://schemas.microsoft.com/office/drawing/2016/5/9/chartex" xmlns:cx4="http://schemas.microsoft.com/office/drawing/2016/5/10/chartex" xmlns:cx5="http://schemas.microsoft.com/office/drawing/2016/5/11/chartex" xmlns:cx6="http://schemas.microsoft.com/office/drawing/2016/5/12/chartex" xmlns:cx7="http://schemas.microsoft.com/office/drawing/2016/5/13/chartex" xmlns:cx8="http://schemas.microsoft.com/office/drawing/2016/5/14/chartex" xmlns:mc="http://schemas.openxmlformats.org/markup-compatibility/2006" xmlns:aink="http://schemas.microsoft.com/office/drawing/2016/ink" xmlns:am3d="http://schemas.microsoft.com/office/drawing/2017/model3d" xmlns:o="urn:schemas-microsoft-com:office:office" xmlns:r="http://schemas.openxmlformats.org/officeDocument/2006/relationships" xmlns:m="http://schemas.openxmlformats.org/officeDocument/2006/math" xmlns:v="urn:schemas-microsoft-com:vml" xmlns:wp14="http://schemas.microsoft.com/office/word/2010/wordprocessingDrawing" xmlns:wp="http://schemas.openxmlformats.org/drawingml/2006/wordprocessingDrawing" xmlns:w10="urn:schemas-microsoft-com:office:word" xmlns:w="http://schemas.openxmlformats.org/wordprocessingml/2006/main" xmlns:w14="http://schemas.microsoft.com/office/word/2010/wordml" xmlns:w15="http://schemas.microsoft.com/office/word/2012/wordml" xmlns:w16cex="http://schemas.microsoft.com/office/word/2018/wordml/cex" xmlns:w16cid="http://schemas.microsoft.com/office/word/2016/wordml/cid" xmlns:w16="http://schemas.microsoft.com/office/word/2018/wordml" xmlns:w16sdtdh="http://schemas.microsoft.com/office/word/2020/wordml/sdtdatahash" xmlns:w16se="http://schemas.microsoft.com/office/word/2015/wordml/symex" xmlns:wpg="http://schemas.microsoft.com/office/word/2010/wordprocessingGroup" xmlns:wpi="http://schemas.microsoft.com/office/word/2010/wordprocessingInk" xmlns:wne="http://schemas.microsoft.com/office/word/2006/wordml" xmlns:wps="http://schemas.microsoft.com/office/word/2010/wordprocessingShape" mc:Ignorable="w14 w15 w16se w16cid w16 w16cex w16sdtdh wp14">
   <w:abstractNum w:abstractNumId="0" w15:restartNumberingAfterBreak="0">
+    <w:nsid w:val="1A805A06"/>
+    <w:multiLevelType w:val="hybridMultilevel"/>
+    <w:tmpl w:val="D3EA50C6"/>
+    <w:lvl w:ilvl="0" w:tplc="04080001">
+      <w:start w:val="1"/>
+      <w:numFmt w:val="bullet"/>
+      <w:lvlText w:val=""/>
+      <w:lvlJc w:val="left"/>
+      <w:pPr>
+        <w:ind w:left="720" w:hanging="360"/>
+      </w:pPr>
+      <w:rPr>
+        <w:rFonts w:ascii="Symbol" w:hAnsi="Symbol" w:hint="default"/>
+      </w:rPr>
+    </w:lvl>
+    <w:lvl w:ilvl="1" w:tplc="04080003" w:tentative="1">
+      <w:start w:val="1"/>
+      <w:numFmt w:val="bullet"/>
+      <w:lvlText w:val="o"/>
+      <w:lvlJc w:val="left"/>
+      <w:pPr>
+        <w:ind w:left="1440" w:hanging="360"/>
+      </w:pPr>
+      <w:rPr>
+        <w:rFonts w:ascii="Courier New" w:hAnsi="Courier New" w:cs="Courier New" w:hint="default"/>
+      </w:rPr>
+    </w:lvl>
+    <w:lvl w:ilvl="2" w:tplc="04080005" w:tentative="1">
+      <w:start w:val="1"/>
+      <w:numFmt w:val="bullet"/>
+      <w:lvlText w:val=""/>
+      <w:lvlJc w:val="left"/>
+      <w:pPr>
+        <w:ind w:left="2160" w:hanging="360"/>
+      </w:pPr>
+      <w:rPr>
+        <w:rFonts w:ascii="Wingdings" w:hAnsi="Wingdings" w:hint="default"/>
+      </w:rPr>
+    </w:lvl>
+    <w:lvl w:ilvl="3" w:tplc="04080001" w:tentative="1">
+      <w:start w:val="1"/>
+      <w:numFmt w:val="bullet"/>
+      <w:lvlText w:val=""/>
+      <w:lvlJc w:val="left"/>
+      <w:pPr>
+        <w:ind w:left="2880" w:hanging="360"/>
+      </w:pPr>
+      <w:rPr>
+        <w:rFonts w:ascii="Symbol" w:hAnsi="Symbol" w:hint="default"/>
+      </w:rPr>
+    </w:lvl>
+    <w:lvl w:ilvl="4" w:tplc="04080003" w:tentative="1">
+      <w:start w:val="1"/>
+      <w:numFmt w:val="bullet"/>
+      <w:lvlText w:val="o"/>
+      <w:lvlJc w:val="left"/>
+      <w:pPr>
+        <w:ind w:left="3600" w:hanging="360"/>
+      </w:pPr>
+      <w:rPr>
+        <w:rFonts w:ascii="Courier New" w:hAnsi="Courier New" w:cs="Courier New" w:hint="default"/>
+      </w:rPr>
+    </w:lvl>
+    <w:lvl w:ilvl="5" w:tplc="04080005" w:tentative="1">
+      <w:start w:val="1"/>
+      <w:numFmt w:val="bullet"/>
+      <w:lvlText w:val=""/>
+      <w:lvlJc w:val="left"/>
+      <w:pPr>
+        <w:ind w:left="4320" w:hanging="360"/>
+      </w:pPr>
+      <w:rPr>
+        <w:rFonts w:ascii="Wingdings" w:hAnsi="Wingdings" w:hint="default"/>
+      </w:rPr>
+    </w:lvl>
+    <w:lvl w:ilvl="6" w:tplc="04080001" w:tentative="1">
+      <w:start w:val="1"/>
+      <w:numFmt w:val="bullet"/>
+      <w:lvlText w:val=""/>
+      <w:lvlJc w:val="left"/>
+      <w:pPr>
+        <w:ind w:left="5040" w:hanging="360"/>
+      </w:pPr>
+      <w:rPr>
+        <w:rFonts w:ascii="Symbol" w:hAnsi="Symbol" w:hint="default"/>
+      </w:rPr>
+    </w:lvl>
+    <w:lvl w:ilvl="7" w:tplc="04080003" w:tentative="1">
+      <w:start w:val="1"/>
+      <w:numFmt w:val="bullet"/>
+      <w:lvlText w:val="o"/>
+      <w:lvlJc w:val="left"/>
+      <w:pPr>
+        <w:ind w:left="5760" w:hanging="360"/>
+      </w:pPr>
+      <w:rPr>
+        <w:rFonts w:ascii="Courier New" w:hAnsi="Courier New" w:cs="Courier New" w:hint="default"/>
+      </w:rPr>
+    </w:lvl>
+    <w:lvl w:ilvl="8" w:tplc="04080005" w:tentative="1">
+      <w:start w:val="1"/>
+      <w:numFmt w:val="bullet"/>
+      <w:lvlText w:val=""/>
+      <w:lvlJc w:val="left"/>
+      <w:pPr>
+        <w:ind w:left="6480" w:hanging="360"/>
+      </w:pPr>
+      <w:rPr>
+        <w:rFonts w:ascii="Wingdings" w:hAnsi="Wingdings" w:hint="default"/>
+      </w:rPr>
+    </w:lvl>
+  </w:abstractNum>
+  <w:abstractNum w:abstractNumId="1" w15:restartNumberingAfterBreak="0">
     <w:nsid w:val="31780607"/>
     <w:multiLevelType w:val="hybridMultilevel"/>
     <w:tmpl w:val="B05A0572"/>
@@ -1201,7 +1748,7 @@
       </w:rPr>
     </w:lvl>
   </w:abstractNum>
-  <w:abstractNum w:abstractNumId="1" w15:restartNumberingAfterBreak="0">
+  <w:abstractNum w:abstractNumId="2" w15:restartNumberingAfterBreak="0">
     <w:nsid w:val="46FB5B43"/>
     <w:multiLevelType w:val="hybridMultilevel"/>
     <w:tmpl w:val="D0804C4C"/>
@@ -1315,10 +1862,13 @@
     </w:lvl>
   </w:abstractNum>
   <w:num w:numId="1">
-    <w:abstractNumId w:val="0"/>
+    <w:abstractNumId w:val="1"/>
   </w:num>
   <w:num w:numId="2">
-    <w:abstractNumId w:val="1"/>
+    <w:abstractNumId w:val="2"/>
+  </w:num>
+  <w:num w:numId="3">
+    <w:abstractNumId w:val="0"/>
   </w:num>
 </w:numbering>
 </file>
@@ -1721,6 +2271,7 @@
   <w:style w:type="paragraph" w:default="1" w:styleId="Normal">
     <w:name w:val="Normal"/>
     <w:qFormat/>
+    <w:rsid w:val="00740168"/>
   </w:style>
   <w:style w:type="character" w:default="1" w:styleId="DefaultParagraphFont">
     <w:name w:val="Default Paragraph Font"/>

</xml_diff>